<commit_message>
Add authors to submission title page: JC first author (Homerton), CR senior and corresponding author
Co-Authored-By: Claude Opus 5 <noreply@anthropic.com>
Claude-Session: https://claude.ai/code/session_01PkNMwEKitkq1tP96RKxYsX
</commit_message>
<xml_diff>
--- a/paper/submission/build/manuscript_bmjopen.docx
+++ b/paper/submission/build/manuscript_bmjopen.docx
@@ -68,7 +68,25 @@
         <w:t xml:space="preserve"> </w:t>
       </w:r>
       <w:r>
-        <w:t xml:space="preserve">[To be confirmed]</w:t>
+        <w:t xml:space="preserve">Jack Callum,</w:t>
+      </w:r>
+      <w:r>
+        <w:rPr>
+          <w:vertAlign w:val="superscript"/>
+        </w:rPr>
+        <w:t xml:space="preserve">1</w:t>
+      </w:r>
+      <w:r>
+        <w:t xml:space="preserve"> </w:t>
+      </w:r>
+      <w:r>
+        <w:t xml:space="preserve">Carl Reynolds</w:t>
+      </w:r>
+      <w:r>
+        <w:rPr>
+          <w:vertAlign w:val="superscript"/>
+        </w:rPr>
+        <w:t xml:space="preserve">2</w:t>
       </w:r>
     </w:p>
     <w:p>
@@ -86,7 +104,31 @@
         <w:t xml:space="preserve"> </w:t>
       </w:r>
       <w:r>
-        <w:t xml:space="preserve">[To be confirmed]</w:t>
+        <w:rPr>
+          <w:vertAlign w:val="superscript"/>
+        </w:rPr>
+        <w:t xml:space="preserve">1</w:t>
+      </w:r>
+      <w:r>
+        <w:t xml:space="preserve"> </w:t>
+      </w:r>
+      <w:r>
+        <w:t xml:space="preserve">Homerton Healthcare NHS Foundation Trust, London, UK [department to be confirmed]</w:t>
+      </w:r>
+      <w:r>
+        <w:t xml:space="preserve"> </w:t>
+      </w:r>
+      <w:r>
+        <w:rPr>
+          <w:vertAlign w:val="superscript"/>
+        </w:rPr>
+        <w:t xml:space="preserve">2</w:t>
+      </w:r>
+      <w:r>
+        <w:t xml:space="preserve"> </w:t>
+      </w:r>
+      <w:r>
+        <w:t xml:space="preserve">[Affiliation to be confirmed]</w:t>
       </w:r>
     </w:p>
     <w:p>
@@ -104,7 +146,33 @@
         <w:t xml:space="preserve"> </w:t>
       </w:r>
       <w:r>
-        <w:t xml:space="preserve">[Name, address, email]</w:t>
+        <w:t xml:space="preserve">Carl Reynolds, [address], drcjar@gmail.com</w:t>
+      </w:r>
+    </w:p>
+    <w:p>
+      <w:pPr>
+        <w:pStyle w:val="BodyText"/>
+      </w:pPr>
+      <w:r>
+        <w:rPr>
+          <w:i/>
+          <w:iCs/>
+        </w:rPr>
+        <w:t xml:space="preserve">Note for the authors: authorship and the contribution statement below are provisional pending</w:t>
+      </w:r>
+      <w:r>
+        <w:rPr>
+          <w:i/>
+          <w:iCs/>
+        </w:rPr>
+        <w:t xml:space="preserve"> </w:t>
+      </w:r>
+      <w:r>
+        <w:rPr>
+          <w:i/>
+          <w:iCs/>
+        </w:rPr>
+        <w:t xml:space="preserve">confirmation from JC.</w:t>
       </w:r>
     </w:p>
     <w:p>
@@ -341,25 +409,31 @@
         <w:t xml:space="preserve"> </w:t>
       </w:r>
       <w:r>
-        <w:t xml:space="preserve">[To be confirmed.] Suggested wording: [X] conceived the study, obtained</w:t>
-      </w:r>
-      <w:r>
-        <w:t xml:space="preserve"> </w:t>
-      </w:r>
-      <w:r>
-        <w:t xml:space="preserve">and processed the data, did the analysis and wrote the first draft. [Y] contributed to the design</w:t>
-      </w:r>
-      <w:r>
-        <w:t xml:space="preserve"> </w:t>
-      </w:r>
-      <w:r>
-        <w:t xml:space="preserve">and interpretation and revised the manuscript. All authors approved the final version and accept</w:t>
-      </w:r>
-      <w:r>
-        <w:t xml:space="preserve"> </w:t>
-      </w:r>
-      <w:r>
-        <w:t xml:space="preserve">accountability for the work.</w:t>
+        <w:t xml:space="preserve">[To be confirmed.] Suggested wording: CR and JC conceived the study. CR</w:t>
+      </w:r>
+      <w:r>
+        <w:t xml:space="preserve"> </w:t>
+      </w:r>
+      <w:r>
+        <w:t xml:space="preserve">obtained and processed the data and did the statistical analysis. JC and CR designed the control and</w:t>
+      </w:r>
+      <w:r>
+        <w:t xml:space="preserve"> </w:t>
+      </w:r>
+      <w:r>
+        <w:t xml:space="preserve">falsification analyses and interpreted the results. JC drafted the manuscript, and CR revised it</w:t>
+      </w:r>
+      <w:r>
+        <w:t xml:space="preserve"> </w:t>
+      </w:r>
+      <w:r>
+        <w:t xml:space="preserve">critically for important intellectual content. Both authors approved the final version and accept</w:t>
+      </w:r>
+      <w:r>
+        <w:t xml:space="preserve"> </w:t>
+      </w:r>
+      <w:r>
+        <w:t xml:space="preserve">accountability for all aspects of the work.</w:t>
       </w:r>
     </w:p>
     <w:p>

</xml_diff>

<commit_message>
Draft JC affiliation from email signature, pending confirmation
Co-Authored-By: Claude Opus 5 <noreply@anthropic.com>
Claude-Session: https://claude.ai/code/session_01PkNMwEKitkq1tP96RKxYsX
</commit_message>
<xml_diff>
--- a/paper/submission/build/manuscript_bmjopen.docx
+++ b/paper/submission/build/manuscript_bmjopen.docx
@@ -113,7 +113,13 @@
         <w:t xml:space="preserve"> </w:t>
       </w:r>
       <w:r>
-        <w:t xml:space="preserve">Homerton Healthcare NHS Foundation Trust, London, UK [department to be confirmed]</w:t>
+        <w:t xml:space="preserve">Respiratory and Sleep Medicine, Homerton University Hospital NHS Foundation Trust, London, UK</w:t>
+      </w:r>
+      <w:r>
+        <w:t xml:space="preserve"> </w:t>
+      </w:r>
+      <w:r>
+        <w:t xml:space="preserve">[taken from JC’s email signature; to be confirmed, including the current legal name of the trust]</w:t>
       </w:r>
       <w:r>
         <w:t xml:space="preserve"> </w:t>

</xml_diff>

<commit_message>
Add QMUL affiliation for CR; corresponding author contact is the academic email
Co-Authored-By: Claude Opus 5 <noreply@anthropic.com>
Claude-Session: https://claude.ai/code/session_01PkNMwEKitkq1tP96RKxYsX
</commit_message>
<xml_diff>
--- a/paper/submission/build/manuscript_bmjopen.docx
+++ b/paper/submission/build/manuscript_bmjopen.docx
@@ -134,7 +134,7 @@
         <w:t xml:space="preserve"> </w:t>
       </w:r>
       <w:r>
-        <w:t xml:space="preserve">[Affiliation to be confirmed]</w:t>
+        <w:t xml:space="preserve">Queen Mary University of London, London, UK</w:t>
       </w:r>
     </w:p>
     <w:p>
@@ -152,7 +152,7 @@
         <w:t xml:space="preserve"> </w:t>
       </w:r>
       <w:r>
-        <w:t xml:space="preserve">Carl Reynolds, [address], academic@carlreynolds.net</w:t>
+        <w:t xml:space="preserve">Carl Reynolds, academic@carlreynolds.net</w:t>
       </w:r>
     </w:p>
     <w:p>

</xml_diff>

<commit_message>
Align submission with BMJ Open house style sampled from 13 recent papers
Co-Authored-By: Claude Opus 5 <noreply@anthropic.com>
</commit_message>
<xml_diff>
--- a/paper/submission/build/manuscript_bmjopen.docx
+++ b/paper/submission/build/manuscript_bmjopen.docx
@@ -2,7 +2,7 @@
 <file path=word/document.xml><?xml version="1.0" encoding="utf-8"?>
 <w:document xmlns:w="http://schemas.openxmlformats.org/wordprocessingml/2006/main" xmlns:m="http://schemas.openxmlformats.org/officeDocument/2006/math" xmlns:r="http://schemas.openxmlformats.org/officeDocument/2006/relationships" xmlns:o="urn:schemas-microsoft-com:office:office" xmlns:v="urn:schemas-microsoft-com:vml" xmlns:w10="urn:schemas-microsoft-com:office:word" xmlns:a="http://schemas.openxmlformats.org/drawingml/2006/main" xmlns:pic="http://schemas.openxmlformats.org/drawingml/2006/picture" xmlns:wp="http://schemas.openxmlformats.org/drawingml/2006/wordprocessingDrawing">
   <w:body>
-    <w:bookmarkStart w:id="40" w:name="title-page"/>
+    <w:bookmarkStart w:id="47" w:name="title-page"/>
     <w:p>
       <w:pPr>
         <w:pStyle w:val="Heading1"/>
@@ -196,7 +196,7 @@
         <w:t xml:space="preserve"> </w:t>
       </w:r>
       <w:r>
-        <w:t xml:space="preserve">Main text: 3456 words. Abstract: 300 words.</w:t>
+        <w:t xml:space="preserve">Main text: 3513 words. Abstract: 302 words.</w:t>
       </w:r>
     </w:p>
     <w:p>
@@ -265,13 +265,91 @@
           <w:b/>
           <w:bCs/>
         </w:rPr>
+        <w:t xml:space="preserve">Funding.</w:t>
+      </w:r>
+      <w:r>
+        <w:t xml:space="preserve"> </w:t>
+      </w:r>
+      <w:r>
+        <w:t xml:space="preserve">This research received no specific grant from any funding agency in the public,</w:t>
+      </w:r>
+      <w:r>
+        <w:t xml:space="preserve"> </w:t>
+      </w:r>
+      <w:r>
+        <w:t xml:space="preserve">commercial or not-for-profit sectors.</w:t>
+      </w:r>
+    </w:p>
+    <w:p>
+      <w:pPr>
+        <w:pStyle w:val="BodyText"/>
+      </w:pPr>
+      <w:r>
+        <w:rPr>
+          <w:b/>
+          <w:bCs/>
+        </w:rPr>
+        <w:t xml:space="preserve">Competing interests.</w:t>
+      </w:r>
+      <w:r>
+        <w:t xml:space="preserve"> </w:t>
+      </w:r>
+      <w:r>
+        <w:t xml:space="preserve">None declared.</w:t>
+      </w:r>
+    </w:p>
+    <w:p>
+      <w:pPr>
+        <w:pStyle w:val="BodyText"/>
+      </w:pPr>
+      <w:r>
+        <w:rPr>
+          <w:b/>
+          <w:bCs/>
+        </w:rPr>
+        <w:t xml:space="preserve">Provenance and peer review.</w:t>
+      </w:r>
+      <w:r>
+        <w:t xml:space="preserve"> </w:t>
+      </w:r>
+      <w:r>
+        <w:t xml:space="preserve">Not commissioned; externally peer reviewed.</w:t>
+      </w:r>
+    </w:p>
+    <w:p>
+      <w:pPr>
+        <w:pStyle w:val="BodyText"/>
+      </w:pPr>
+      <w:r>
+        <w:rPr>
+          <w:b/>
+          <w:bCs/>
+        </w:rPr>
+        <w:t xml:space="preserve">Patient consent for publication.</w:t>
+      </w:r>
+      <w:r>
+        <w:t xml:space="preserve"> </w:t>
+      </w:r>
+      <w:r>
+        <w:t xml:space="preserve">Not applicable.</w:t>
+      </w:r>
+    </w:p>
+    <w:p>
+      <w:pPr>
+        <w:pStyle w:val="BodyText"/>
+      </w:pPr>
+      <w:r>
+        <w:rPr>
+          <w:b/>
+          <w:bCs/>
+        </w:rPr>
         <w:t xml:space="preserve">Ethics approval.</w:t>
       </w:r>
       <w:r>
         <w:t xml:space="preserve"> </w:t>
       </w:r>
       <w:r>
-        <w:t xml:space="preserve">Not required. All data are aggregate, openly published and anonymous, and no</w:t>
+        <w:t xml:space="preserve">Not applicable. All data are aggregate, openly published and anonymous, and no</w:t>
       </w:r>
       <w:r>
         <w:t xml:space="preserve"> </w:t>
@@ -301,7 +379,13 @@
         <w:t xml:space="preserve"> </w:t>
       </w:r>
       <w:r>
-        <w:t xml:space="preserve">conduct, reporting or dissemination of this research, which used aggregate published statistics.</w:t>
+        <w:t xml:space="preserve">conduct, reporting or dissemination plans of this research, which used aggregate published</w:t>
+      </w:r>
+      <w:r>
+        <w:t xml:space="preserve"> </w:t>
+      </w:r>
+      <w:r>
+        <w:t xml:space="preserve">statistics.</w:t>
       </w:r>
     </w:p>
     <w:p>
@@ -367,48 +451,6 @@
           <w:b/>
           <w:bCs/>
         </w:rPr>
-        <w:t xml:space="preserve">Funding.</w:t>
-      </w:r>
-      <w:r>
-        <w:t xml:space="preserve"> </w:t>
-      </w:r>
-      <w:r>
-        <w:t xml:space="preserve">This research received no specific grant from any funding agency in the public,</w:t>
-      </w:r>
-      <w:r>
-        <w:t xml:space="preserve"> </w:t>
-      </w:r>
-      <w:r>
-        <w:t xml:space="preserve">commercial or not-for-profit sectors.</w:t>
-      </w:r>
-    </w:p>
-    <w:p>
-      <w:pPr>
-        <w:pStyle w:val="BodyText"/>
-      </w:pPr>
-      <w:r>
-        <w:rPr>
-          <w:b/>
-          <w:bCs/>
-        </w:rPr>
-        <w:t xml:space="preserve">Competing interests.</w:t>
-      </w:r>
-      <w:r>
-        <w:t xml:space="preserve"> </w:t>
-      </w:r>
-      <w:r>
-        <w:t xml:space="preserve">None declared.</w:t>
-      </w:r>
-    </w:p>
-    <w:p>
-      <w:pPr>
-        <w:pStyle w:val="BodyText"/>
-      </w:pPr>
-      <w:r>
-        <w:rPr>
-          <w:b/>
-          <w:bCs/>
-        </w:rPr>
         <w:t xml:space="preserve">Author contributions.</w:t>
       </w:r>
       <w:r>
@@ -641,7 +683,7 @@
           <w:b/>
           <w:bCs/>
         </w:rPr>
-        <w:t xml:space="preserve">Main outcome measures.</w:t>
+        <w:t xml:space="preserve">Primary and secondary outcome measures.</w:t>
       </w:r>
       <w:r>
         <w:t xml:space="preserve"> </w:t>
@@ -1119,7 +1161,7 @@
       </w:r>
     </w:p>
     <w:bookmarkEnd w:id="23"/>
-    <w:bookmarkStart w:id="30" w:name="methods"/>
+    <w:bookmarkStart w:id="31" w:name="methods"/>
     <w:p>
       <w:pPr>
         <w:pStyle w:val="Heading2"/>
@@ -1234,12 +1276,36 @@
       </w:r>
     </w:p>
     <w:bookmarkEnd w:id="24"/>
-    <w:bookmarkStart w:id="25" w:name="tb-notifications"/>
+    <w:bookmarkStart w:id="25" w:name="patient-and-public-involvement"/>
     <w:p>
       <w:pPr>
         <w:pStyle w:val="Heading3"/>
       </w:pPr>
       <w:r>
+        <w:t xml:space="preserve">Patient and public involvement</w:t>
+      </w:r>
+    </w:p>
+    <w:p>
+      <w:pPr>
+        <w:pStyle w:val="FirstParagraph"/>
+      </w:pPr>
+      <w:r>
+        <w:t xml:space="preserve">Patients and the public were not involved in the design, conduct, reporting or dissemination plans</w:t>
+      </w:r>
+      <w:r>
+        <w:t xml:space="preserve"> </w:t>
+      </w:r>
+      <w:r>
+        <w:t xml:space="preserve">of this research, which used only aggregate published statistics.</w:t>
+      </w:r>
+    </w:p>
+    <w:bookmarkEnd w:id="25"/>
+    <w:bookmarkStart w:id="26" w:name="tb-notifications"/>
+    <w:p>
+      <w:pPr>
+        <w:pStyle w:val="Heading3"/>
+      </w:pPr>
+      <w:r>
         <w:t xml:space="preserve">TB notifications</w:t>
       </w:r>
     </w:p>
@@ -1305,8 +1371,8 @@
         <w:t xml:space="preserve">to reflect service disruption rather than less disease [25,26].</w:t>
       </w:r>
     </w:p>
-    <w:bookmarkEnd w:id="25"/>
-    <w:bookmarkStart w:id="26" w:name="primary-care-prescribing"/>
+    <w:bookmarkEnd w:id="26"/>
+    <w:bookmarkStart w:id="27" w:name="primary-care-prescribing"/>
     <w:p>
       <w:pPr>
         <w:pStyle w:val="Heading3"/>
@@ -1435,8 +1501,8 @@
         <w:t xml:space="preserve">Denominators were ONS mid-year population estimates.</w:t>
       </w:r>
     </w:p>
-    <w:bookmarkEnd w:id="26"/>
-    <w:bookmarkStart w:id="27" w:name="hospital-medicines"/>
+    <w:bookmarkEnd w:id="27"/>
+    <w:bookmarkStart w:id="28" w:name="hospital-medicines"/>
     <w:p>
       <w:pPr>
         <w:pStyle w:val="Heading3"/>
@@ -1519,8 +1585,8 @@
         <w:t xml:space="preserve">acute trust catchment populations, with elective-admission catchments as a sensitivity analysis.</w:t>
       </w:r>
     </w:p>
-    <w:bookmarkEnd w:id="27"/>
-    <w:bookmarkStart w:id="28" w:name="covariates"/>
+    <w:bookmarkEnd w:id="28"/>
+    <w:bookmarkStart w:id="29" w:name="covariates"/>
     <w:p>
       <w:pPr>
         <w:pStyle w:val="Heading3"/>
@@ -1567,8 +1633,8 @@
         <w:t xml:space="preserve">the 2021 Census percentage born outside the UK.</w:t>
       </w:r>
     </w:p>
-    <w:bookmarkEnd w:id="28"/>
-    <w:bookmarkStart w:id="29" w:name="statistical-analysis"/>
+    <w:bookmarkEnd w:id="29"/>
+    <w:bookmarkStart w:id="30" w:name="statistical-analysis"/>
     <w:p>
       <w:pPr>
         <w:pStyle w:val="Heading3"/>
@@ -1840,9 +1906,9 @@
         <w:t xml:space="preserve">Analyses used Python 3.14 with pandas and statsmodels. Code and outputs are openly available.</w:t>
       </w:r>
     </w:p>
-    <w:bookmarkEnd w:id="29"/>
     <w:bookmarkEnd w:id="30"/>
-    <w:bookmarkStart w:id="35" w:name="results"/>
+    <w:bookmarkEnd w:id="31"/>
+    <w:bookmarkStart w:id="36" w:name="results"/>
     <w:p>
       <w:pPr>
         <w:pStyle w:val="Heading2"/>
@@ -1851,7 +1917,7 @@
         <w:t xml:space="preserve">Results</w:t>
       </w:r>
     </w:p>
-    <w:bookmarkStart w:id="31" w:name="prescribing-and-notifications"/>
+    <w:bookmarkStart w:id="32" w:name="prescribing-and-notifications"/>
     <w:p>
       <w:pPr>
         <w:pStyle w:val="Heading3"/>
@@ -1918,8 +1984,8 @@
         <w:t xml:space="preserve">data.</w:t>
       </w:r>
     </w:p>
-    <w:bookmarkEnd w:id="31"/>
-    <w:bookmarkStart w:id="32" w:name="X845572c17123007ca4ac7d193ea63fed69a85ae"/>
+    <w:bookmarkEnd w:id="32"/>
+    <w:bookmarkStart w:id="33" w:name="X845572c17123007ca4ac7d193ea63fed69a85ae"/>
     <w:p>
       <w:pPr>
         <w:pStyle w:val="Heading3"/>
@@ -2106,8 +2172,8 @@
         <w:t xml:space="preserve">the only outcome year whose previous-year exposure comes from the earlier prescribing series.</w:t>
       </w:r>
     </w:p>
-    <w:bookmarkEnd w:id="32"/>
-    <w:bookmarkStart w:id="33" w:name="hospital-medicines-1"/>
+    <w:bookmarkEnd w:id="33"/>
+    <w:bookmarkStart w:id="34" w:name="hospital-medicines-1"/>
     <w:p>
       <w:pPr>
         <w:pStyle w:val="Heading3"/>
@@ -2240,8 +2306,8 @@
         <w:t xml:space="preserve">12 of them the expected same-year associations for the two TB treatment groups.</w:t>
       </w:r>
     </w:p>
-    <w:bookmarkEnd w:id="33"/>
-    <w:bookmarkStart w:id="34" w:name="X8ef038c16537b5215364c75c720404e0d8ae7e7"/>
+    <w:bookmarkEnd w:id="34"/>
+    <w:bookmarkStart w:id="35" w:name="X8ef038c16537b5215364c75c720404e0d8ae7e7"/>
     <w:p>
       <w:pPr>
         <w:pStyle w:val="Heading3"/>
@@ -2402,9 +2468,9 @@
         <w:t xml:space="preserve">the same effect was 65%.</w:t>
       </w:r>
     </w:p>
-    <w:bookmarkEnd w:id="34"/>
     <w:bookmarkEnd w:id="35"/>
-    <w:bookmarkStart w:id="36" w:name="discussion"/>
+    <w:bookmarkEnd w:id="36"/>
+    <w:bookmarkStart w:id="42" w:name="discussion"/>
     <w:p>
       <w:pPr>
         <w:pStyle w:val="Heading2"/>
@@ -2413,6 +2479,15 @@
         <w:t xml:space="preserve">Discussion</w:t>
       </w:r>
     </w:p>
+    <w:bookmarkStart w:id="37" w:name="principal-findings"/>
+    <w:p>
+      <w:pPr>
+        <w:pStyle w:val="Heading3"/>
+      </w:pPr>
+      <w:r>
+        <w:t xml:space="preserve">Principal findings</w:t>
+      </w:r>
+    </w:p>
     <w:p>
       <w:pPr>
         <w:pStyle w:val="FirstParagraph"/>
@@ -2445,90 +2520,330 @@
         <w:t xml:space="preserve">risks or by national records of drug-associated TB.</w:t>
       </w:r>
     </w:p>
+    <w:bookmarkEnd w:id="37"/>
+    <w:bookmarkStart w:id="38" w:name="why-plausible-effects-are-undetectable"/>
+    <w:p>
+      <w:pPr>
+        <w:pStyle w:val="Heading3"/>
+      </w:pPr>
+      <w:r>
+        <w:t xml:space="preserve">Why plausible effects are undetectable</w:t>
+      </w:r>
+    </w:p>
+    <w:p>
+      <w:pPr>
+        <w:pStyle w:val="FirstParagraph"/>
+      </w:pPr>
+      <w:r>
+        <w:t xml:space="preserve">Three features explain this. First, expected population effects are small: oral glucocorticoids</w:t>
+      </w:r>
+      <w:r>
+        <w:t xml:space="preserve"> </w:t>
+      </w:r>
+      <w:r>
+        <w:t xml:space="preserve">carry an odds ratio of about 5 [4] but are used by about 1% of people at any time</w:t>
+      </w:r>
+      <w:r>
+        <w:t xml:space="preserve"> </w:t>
+      </w:r>
+      <w:r>
+        <w:t xml:space="preserve">[28,29], so a 10% change in use should change notifications by about 0.3%, and</w:t>
+      </w:r>
+      <w:r>
+        <w:t xml:space="preserve"> </w:t>
+      </w:r>
+      <w:r>
+        <w:t xml:space="preserve">recorded steroid-associated immunosuppression implies less [1]. Screening for latent</w:t>
+      </w:r>
+      <w:r>
+        <w:t xml:space="preserve"> </w:t>
+      </w:r>
+      <w:r>
+        <w:t xml:space="preserve">infection before anti-TNF therapy has been standard since 2005 [9] and largely removes the</w:t>
+      </w:r>
+      <w:r>
+        <w:t xml:space="preserve"> </w:t>
+      </w:r>
+      <w:r>
+        <w:t xml:space="preserve">excess risk [10], so the risk relevant to a marginal increase in biologic use is small.</w:t>
+      </w:r>
+      <w:r>
+        <w:t xml:space="preserve"> </w:t>
+      </w:r>
+      <w:r>
+        <w:t xml:space="preserve">Second, the data carry little information: within-area variation in prescribing was very small</w:t>
+      </w:r>
+      <w:r>
+        <w:t xml:space="preserve"> </w:t>
+      </w:r>
+      <w:r>
+        <w:t xml:space="preserve">against between-area variation, and fixed effects remove the between-area variation where most</w:t>
+      </w:r>
+      <w:r>
+        <w:t xml:space="preserve"> </w:t>
+      </w:r>
+      <w:r>
+        <w:t xml:space="preserve">information lies [30], while power in aggregate studies depends mainly on the number of</w:t>
+      </w:r>
+      <w:r>
+        <w:t xml:space="preserve"> </w:t>
+      </w:r>
+      <w:r>
+        <w:t xml:space="preserve">areas [16], which cannot be increased. Third, the linkage attenuates: the positive</w:t>
+      </w:r>
+      <w:r>
+        <w:t xml:space="preserve"> </w:t>
+      </w:r>
+      <w:r>
+        <w:t xml:space="preserve">control, a drug used almost exclusively for the outcome, was recovered with an elasticity of only</w:t>
+      </w:r>
+      <w:r>
+        <w:t xml:space="preserve"> </w:t>
+      </w:r>
+      <w:r>
+        <w:t xml:space="preserve">0.36 to 0.40, and a similar elasticity for less specific TB drugs suggests apportionment rather than</w:t>
+      </w:r>
+      <w:r>
+        <w:t xml:space="preserve"> </w:t>
+      </w:r>
+      <w:r>
+        <w:t xml:space="preserve">drug specificity as the main cause. No equivalent positive control exists for primary care</w:t>
+      </w:r>
+      <w:r>
+        <w:t xml:space="preserve"> </w:t>
+      </w:r>
+      <w:r>
+        <w:t xml:space="preserve">prescribing, so the validity of that linkage remains untested.</w:t>
+      </w:r>
+    </w:p>
+    <w:bookmarkEnd w:id="38"/>
+    <w:bookmarkStart w:id="39" w:name="Xe4bb212fae5c022a8778b7961f916abbc004630"/>
+    <w:p>
+      <w:pPr>
+        <w:pStyle w:val="Heading3"/>
+      </w:pPr>
+      <w:r>
+        <w:t xml:space="preserve">Residual confounding and the nominal associations</w:t>
+      </w:r>
+    </w:p>
+    <w:p>
+      <w:pPr>
+        <w:pStyle w:val="FirstParagraph"/>
+      </w:pPr>
+      <w:r>
+        <w:t xml:space="preserve">Two patterns indicate residual confounding rather than drug effects. The negative-control exposure,</w:t>
+      </w:r>
+      <w:r>
+        <w:t xml:space="preserve"> </w:t>
+      </w:r>
+      <w:r>
+        <w:t xml:space="preserve">which has no plausible effect on TB, was inversely associated with notifications to the same degree</w:t>
+      </w:r>
+      <w:r>
+        <w:t xml:space="preserve"> </w:t>
+      </w:r>
+      <w:r>
+        <w:t xml:space="preserve">as metformin; and prescribing in the following year was inversely associated with notifications for</w:t>
+      </w:r>
+      <w:r>
+        <w:t xml:space="preserve"> </w:t>
+      </w:r>
+      <w:r>
+        <w:t xml:space="preserve">several groups, which persisted when same-year prescribing was added and the estimates were almost</w:t>
+      </w:r>
+      <w:r>
+        <w:t xml:space="preserve"> </w:t>
+      </w:r>
+      <w:r>
+        <w:t xml:space="preserve">uncorrelated. Both are expected when prescribing and notifications share area-specific trends, for</w:t>
+      </w:r>
+      <w:r>
+        <w:t xml:space="preserve"> </w:t>
+      </w:r>
+      <w:r>
+        <w:t xml:space="preserve">example migration-driven changes in population age and origin, accompanying changes in practice</w:t>
+      </w:r>
+      <w:r>
+        <w:t xml:space="preserve"> </w:t>
+      </w:r>
+      <w:r>
+        <w:t xml:space="preserve">registration, and changes in diagnostic activity. Year fixed effects cannot remove such trends.</w:t>
+      </w:r>
+      <w:r>
+        <w:t xml:space="preserve"> </w:t>
+      </w:r>
+      <w:r>
+        <w:t xml:space="preserve">Area-level adjustment also cannot remove cross-level bias [14,15]: people</w:t>
+      </w:r>
+      <w:r>
+        <w:t xml:space="preserve"> </w:t>
+      </w:r>
+      <w:r>
+        <w:t xml:space="preserve">prescribed glucocorticoids are mostly older and UK-born, whereas most notifications are in younger</w:t>
+      </w:r>
+      <w:r>
+        <w:t xml:space="preserve"> </w:t>
+      </w:r>
+      <w:r>
+        <w:t xml:space="preserve">people born abroad. Protopathic prescribing for undiagnosed TB, and glucocorticoids used in treating</w:t>
+      </w:r>
+      <w:r>
+        <w:t xml:space="preserve"> </w:t>
+      </w:r>
+      <w:r>
+        <w:t xml:space="preserve">TB meningitis and pericarditis [31], further complicate same-year associations, which is</w:t>
+      </w:r>
+      <w:r>
+        <w:t xml:space="preserve"> </w:t>
+      </w:r>
+      <w:r>
+        <w:t xml:space="preserve">why the primary exposure was the previous year.</w:t>
+      </w:r>
+    </w:p>
     <w:p>
       <w:pPr>
         <w:pStyle w:val="BodyText"/>
       </w:pPr>
       <w:r>
-        <w:t xml:space="preserve">Three features explain this. First, expected population effects are small: oral glucocorticoids</w:t>
-      </w:r>
-      <w:r>
-        <w:t xml:space="preserve"> </w:t>
-      </w:r>
-      <w:r>
-        <w:t xml:space="preserve">carry an odds ratio of about 5 [4] but are used by about 1% of people at any time</w:t>
-      </w:r>
-      <w:r>
-        <w:t xml:space="preserve"> </w:t>
-      </w:r>
-      <w:r>
-        <w:t xml:space="preserve">[28,29], so a 10% change in use should change notifications by about 0.3%, and</w:t>
-      </w:r>
-      <w:r>
-        <w:t xml:space="preserve"> </w:t>
-      </w:r>
-      <w:r>
-        <w:t xml:space="preserve">recorded steroid-associated immunosuppression implies less [1]. Screening for latent</w:t>
-      </w:r>
-      <w:r>
-        <w:t xml:space="preserve"> </w:t>
-      </w:r>
-      <w:r>
-        <w:t xml:space="preserve">infection before anti-TNF therapy has been standard since 2005 [9] and largely removes the</w:t>
-      </w:r>
-      <w:r>
-        <w:t xml:space="preserve"> </w:t>
-      </w:r>
-      <w:r>
-        <w:t xml:space="preserve">excess risk [10], so the risk relevant to a marginal increase in biologic use is small.</w:t>
-      </w:r>
-      <w:r>
-        <w:t xml:space="preserve"> </w:t>
-      </w:r>
-      <w:r>
-        <w:t xml:space="preserve">Second, the data carry little information: within-area variation in prescribing was very small</w:t>
-      </w:r>
-      <w:r>
-        <w:t xml:space="preserve"> </w:t>
-      </w:r>
-      <w:r>
-        <w:t xml:space="preserve">against between-area variation, and fixed effects remove the between-area variation where most</w:t>
-      </w:r>
-      <w:r>
-        <w:t xml:space="preserve"> </w:t>
-      </w:r>
-      <w:r>
-        <w:t xml:space="preserve">information lies [30], while power in aggregate studies depends mainly on the number of</w:t>
-      </w:r>
-      <w:r>
-        <w:t xml:space="preserve"> </w:t>
-      </w:r>
-      <w:r>
-        <w:t xml:space="preserve">areas [16], which cannot be increased. Third, the linkage attenuates: the positive</w:t>
-      </w:r>
-      <w:r>
-        <w:t xml:space="preserve"> </w:t>
-      </w:r>
-      <w:r>
-        <w:t xml:space="preserve">control, a drug used almost exclusively for the outcome, was recovered with an elasticity of only</w:t>
-      </w:r>
-      <w:r>
-        <w:t xml:space="preserve"> </w:t>
-      </w:r>
-      <w:r>
-        <w:t xml:space="preserve">0.36 to 0.40, and a similar elasticity for less specific TB drugs suggests apportionment rather than</w:t>
-      </w:r>
-      <w:r>
-        <w:t xml:space="preserve"> </w:t>
-      </w:r>
-      <w:r>
-        <w:t xml:space="preserve">drug specificity as the main cause. No equivalent positive control exists for primary care</w:t>
-      </w:r>
-      <w:r>
-        <w:t xml:space="preserve"> </w:t>
-      </w:r>
-      <w:r>
-        <w:t xml:space="preserve">prescribing, so the validity of that linkage remains untested.</w:t>
+        <w:t xml:space="preserve">The one nominal candidate association, for hospital systemic glucocorticoids, illustrates the</w:t>
+      </w:r>
+      <w:r>
+        <w:t xml:space="preserve"> </w:t>
+      </w:r>
+      <w:r>
+        <w:t xml:space="preserve">argument rather than contradicting it. It did not survive clustering by trust, disappeared when</w:t>
+      </w:r>
+      <w:r>
+        <w:t xml:space="preserve"> </w:t>
+      </w:r>
+      <w:r>
+        <w:t xml:space="preserve">intravenous methylprednisolone pulses were excluded, and would imply an attributable fraction some</w:t>
+      </w:r>
+      <w:r>
+        <w:t xml:space="preserve"> </w:t>
+      </w:r>
+      <w:r>
+        <w:t xml:space="preserve">50 times larger than surveillance records support. The same applies to the regional association</w:t>
+      </w:r>
+      <w:r>
+        <w:t xml:space="preserve"> </w:t>
+      </w:r>
+      <w:r>
+        <w:t xml:space="preserve">between prednisolone dose and UK-born TB: it exceeded the maximum attainable under any relative</w:t>
+      </w:r>
+      <w:r>
+        <w:t xml:space="preserve"> </w:t>
+      </w:r>
+      <w:r>
+        <w:t xml:space="preserve">risk, was not significant by randomisation inference, and depended on one region.</w:t>
+      </w:r>
+    </w:p>
+    <w:bookmarkEnd w:id="39"/>
+    <w:bookmarkStart w:id="40" w:name="strengths-and-limitations"/>
+    <w:p>
+      <w:pPr>
+        <w:pStyle w:val="Heading3"/>
+      </w:pPr>
+      <w:r>
+        <w:t xml:space="preserve">Strengths and limitations</w:t>
+      </w:r>
+    </w:p>
+    <w:p>
+      <w:pPr>
+        <w:pStyle w:val="FirstParagraph"/>
+      </w:pPr>
+      <w:r>
+        <w:t xml:space="preserve">This study has limitations beyond those in the summary box. Exposure was prescribing volume per</w:t>
+      </w:r>
+      <w:r>
+        <w:t xml:space="preserve"> </w:t>
+      </w:r>
+      <w:r>
+        <w:t xml:space="preserve">resident, not people treated, and additional volume may lengthen existing courses rather than reach</w:t>
+      </w:r>
+      <w:r>
+        <w:t xml:space="preserve"> </w:t>
+      </w:r>
+      <w:r>
+        <w:t xml:space="preserve">new users. Apportionment used annual registration snapshots, and hospital quantities were</w:t>
+      </w:r>
+      <w:r>
+        <w:t xml:space="preserve"> </w:t>
+      </w:r>
+      <w:r>
+        <w:t xml:space="preserve">apportioned with 2024 catchments applied to earlier years. Prescriptions written in hospital and</w:t>
+      </w:r>
+      <w:r>
+        <w:t xml:space="preserve"> </w:t>
+      </w:r>
+      <w:r>
+        <w:t xml:space="preserve">dispensed in the community were excluded by the restriction to general practices. The outcome is</w:t>
+      </w:r>
+      <w:r>
+        <w:t xml:space="preserve"> </w:t>
+      </w:r>
+      <w:r>
+        <w:t xml:space="preserve">notified TB, subject to diagnostic delay and to the 2021 change of surveillance system. Social risk</w:t>
+      </w:r>
+      <w:r>
+        <w:t xml:space="preserve"> </w:t>
+      </w:r>
+      <w:r>
+        <w:t xml:space="preserve">factors and the area-level share of recent arrivals were not available as consistent annual series.</w:t>
+      </w:r>
+    </w:p>
+    <w:bookmarkEnd w:id="40"/>
+    <w:bookmarkStart w:id="41" w:name="X1e1bfc5af9f94b0ed2043b708c6da1d96e9397c"/>
+    <w:p>
+      <w:pPr>
+        <w:pStyle w:val="Heading3"/>
+      </w:pPr>
+      <w:r>
+        <w:t xml:space="preserve">Implications for research and for TB programmes</w:t>
+      </w:r>
+    </w:p>
+    <w:p>
+      <w:pPr>
+        <w:pStyle w:val="FirstParagraph"/>
+      </w:pPr>
+      <w:r>
+        <w:t xml:space="preserve">Open prescribing data are valuable for describing prescribing and its variation [20,32], but they cannot estimate the effects of medicines on a rare outcome such as</w:t>
+      </w:r>
+      <w:r>
+        <w:t xml:space="preserve"> </w:t>
+      </w:r>
+      <w:r>
+        <w:t xml:space="preserve">TB. Ecological studies of rare outcomes should report the minimum detectable effect, a positive</w:t>
+      </w:r>
+      <w:r>
+        <w:t xml:space="preserve"> </w:t>
+      </w:r>
+      <w:r>
+        <w:t xml:space="preserve">control with its elasticity, negative controls and falsification tests alongside any association;</w:t>
+      </w:r>
+      <w:r>
+        <w:t xml:space="preserve"> </w:t>
+      </w:r>
+      <w:r>
+        <w:t xml:space="preserve">had we reported only the primary estimates, several nominal associations here could have been</w:t>
+      </w:r>
+      <w:r>
+        <w:t xml:space="preserve"> </w:t>
+      </w:r>
+      <w:r>
+        <w:t xml:space="preserve">over-interpreted. Causal questions need individual-level linked data analysed as a target trial</w:t>
+      </w:r>
+      <w:r>
+        <w:t xml:space="preserve"> </w:t>
+      </w:r>
+      <w:r>
+        <w:t xml:space="preserve">emulation, and even national cohorts give wide intervals for modest relative risks [33];</w:t>
+      </w:r>
+      <w:r>
+        <w:t xml:space="preserve"> </w:t>
+      </w:r>
+      <w:r>
+        <w:t xml:space="preserve">the only drug–TB target trial emulation we identified concerned DPP-4 inhibitors [34].</w:t>
       </w:r>
     </w:p>
     <w:p>
@@ -2536,206 +2851,6 @@
         <w:pStyle w:val="BodyText"/>
       </w:pPr>
       <w:r>
-        <w:t xml:space="preserve">Two patterns indicate residual confounding rather than drug effects. The negative-control exposure,</w:t>
-      </w:r>
-      <w:r>
-        <w:t xml:space="preserve"> </w:t>
-      </w:r>
-      <w:r>
-        <w:t xml:space="preserve">which has no plausible effect on TB, was inversely associated with notifications to the same degree</w:t>
-      </w:r>
-      <w:r>
-        <w:t xml:space="preserve"> </w:t>
-      </w:r>
-      <w:r>
-        <w:t xml:space="preserve">as metformin; and prescribing in the following year was inversely associated with notifications for</w:t>
-      </w:r>
-      <w:r>
-        <w:t xml:space="preserve"> </w:t>
-      </w:r>
-      <w:r>
-        <w:t xml:space="preserve">several groups, which persisted when same-year prescribing was added and the estimates were almost</w:t>
-      </w:r>
-      <w:r>
-        <w:t xml:space="preserve"> </w:t>
-      </w:r>
-      <w:r>
-        <w:t xml:space="preserve">uncorrelated. Both are expected when prescribing and notifications share area-specific trends, for</w:t>
-      </w:r>
-      <w:r>
-        <w:t xml:space="preserve"> </w:t>
-      </w:r>
-      <w:r>
-        <w:t xml:space="preserve">example migration-driven changes in population age and origin, accompanying changes in practice</w:t>
-      </w:r>
-      <w:r>
-        <w:t xml:space="preserve"> </w:t>
-      </w:r>
-      <w:r>
-        <w:t xml:space="preserve">registration, and changes in diagnostic activity. Year fixed effects cannot remove such trends.</w:t>
-      </w:r>
-      <w:r>
-        <w:t xml:space="preserve"> </w:t>
-      </w:r>
-      <w:r>
-        <w:t xml:space="preserve">Area-level adjustment also cannot remove cross-level bias [14,15]: people</w:t>
-      </w:r>
-      <w:r>
-        <w:t xml:space="preserve"> </w:t>
-      </w:r>
-      <w:r>
-        <w:t xml:space="preserve">prescribed glucocorticoids are mostly older and UK-born, whereas most notifications are in younger</w:t>
-      </w:r>
-      <w:r>
-        <w:t xml:space="preserve"> </w:t>
-      </w:r>
-      <w:r>
-        <w:t xml:space="preserve">people born abroad. Protopathic prescribing for undiagnosed TB, and glucocorticoids used in treating</w:t>
-      </w:r>
-      <w:r>
-        <w:t xml:space="preserve"> </w:t>
-      </w:r>
-      <w:r>
-        <w:t xml:space="preserve">TB meningitis and pericarditis [31], further complicate same-year associations, which is</w:t>
-      </w:r>
-      <w:r>
-        <w:t xml:space="preserve"> </w:t>
-      </w:r>
-      <w:r>
-        <w:t xml:space="preserve">why the primary exposure was the previous year.</w:t>
-      </w:r>
-    </w:p>
-    <w:p>
-      <w:pPr>
-        <w:pStyle w:val="BodyText"/>
-      </w:pPr>
-      <w:r>
-        <w:t xml:space="preserve">The one nominal candidate association, for hospital systemic glucocorticoids, illustrates the</w:t>
-      </w:r>
-      <w:r>
-        <w:t xml:space="preserve"> </w:t>
-      </w:r>
-      <w:r>
-        <w:t xml:space="preserve">argument rather than contradicting it. It did not survive clustering by trust, disappeared when</w:t>
-      </w:r>
-      <w:r>
-        <w:t xml:space="preserve"> </w:t>
-      </w:r>
-      <w:r>
-        <w:t xml:space="preserve">intravenous methylprednisolone pulses were excluded, and would imply an attributable fraction some</w:t>
-      </w:r>
-      <w:r>
-        <w:t xml:space="preserve"> </w:t>
-      </w:r>
-      <w:r>
-        <w:t xml:space="preserve">50 times larger than surveillance records support. The same applies to the regional association</w:t>
-      </w:r>
-      <w:r>
-        <w:t xml:space="preserve"> </w:t>
-      </w:r>
-      <w:r>
-        <w:t xml:space="preserve">between prednisolone dose and UK-born TB: it exceeded the maximum attainable under any relative</w:t>
-      </w:r>
-      <w:r>
-        <w:t xml:space="preserve"> </w:t>
-      </w:r>
-      <w:r>
-        <w:t xml:space="preserve">risk, was not significant by randomisation inference, and depended on one region.</w:t>
-      </w:r>
-    </w:p>
-    <w:p>
-      <w:pPr>
-        <w:pStyle w:val="BodyText"/>
-      </w:pPr>
-      <w:r>
-        <w:t xml:space="preserve">This study has limitations beyond those in the summary box. Exposure was prescribing volume per</w:t>
-      </w:r>
-      <w:r>
-        <w:t xml:space="preserve"> </w:t>
-      </w:r>
-      <w:r>
-        <w:t xml:space="preserve">resident, not people treated, and additional volume may lengthen existing courses rather than reach</w:t>
-      </w:r>
-      <w:r>
-        <w:t xml:space="preserve"> </w:t>
-      </w:r>
-      <w:r>
-        <w:t xml:space="preserve">new users. Apportionment used annual registration snapshots, and hospital quantities were</w:t>
-      </w:r>
-      <w:r>
-        <w:t xml:space="preserve"> </w:t>
-      </w:r>
-      <w:r>
-        <w:t xml:space="preserve">apportioned with 2024 catchments applied to earlier years. Prescriptions written in hospital and</w:t>
-      </w:r>
-      <w:r>
-        <w:t xml:space="preserve"> </w:t>
-      </w:r>
-      <w:r>
-        <w:t xml:space="preserve">dispensed in the community were excluded by the restriction to general practices. The outcome is</w:t>
-      </w:r>
-      <w:r>
-        <w:t xml:space="preserve"> </w:t>
-      </w:r>
-      <w:r>
-        <w:t xml:space="preserve">notified TB, subject to diagnostic delay and to the 2021 change of surveillance system. Social risk</w:t>
-      </w:r>
-      <w:r>
-        <w:t xml:space="preserve"> </w:t>
-      </w:r>
-      <w:r>
-        <w:t xml:space="preserve">factors and the area-level share of recent arrivals were not available as consistent annual series.</w:t>
-      </w:r>
-    </w:p>
-    <w:p>
-      <w:pPr>
-        <w:pStyle w:val="BodyText"/>
-      </w:pPr>
-      <w:r>
-        <w:t xml:space="preserve">Open prescribing data are valuable for describing prescribing and its variation [20,32], but they cannot estimate the effects of medicines on a rare outcome such as</w:t>
-      </w:r>
-      <w:r>
-        <w:t xml:space="preserve"> </w:t>
-      </w:r>
-      <w:r>
-        <w:t xml:space="preserve">TB. Ecological studies of rare outcomes should report the minimum detectable effect, a positive</w:t>
-      </w:r>
-      <w:r>
-        <w:t xml:space="preserve"> </w:t>
-      </w:r>
-      <w:r>
-        <w:t xml:space="preserve">control with its elasticity, negative controls and falsification tests alongside any association;</w:t>
-      </w:r>
-      <w:r>
-        <w:t xml:space="preserve"> </w:t>
-      </w:r>
-      <w:r>
-        <w:t xml:space="preserve">had we reported only the primary estimates, several nominal associations here could have been</w:t>
-      </w:r>
-      <w:r>
-        <w:t xml:space="preserve"> </w:t>
-      </w:r>
-      <w:r>
-        <w:t xml:space="preserve">over-interpreted. Causal questions need individual-level linked data analysed as a target trial</w:t>
-      </w:r>
-      <w:r>
-        <w:t xml:space="preserve"> </w:t>
-      </w:r>
-      <w:r>
-        <w:t xml:space="preserve">emulation, and even national cohorts give wide intervals for modest relative risks [33];</w:t>
-      </w:r>
-      <w:r>
-        <w:t xml:space="preserve"> </w:t>
-      </w:r>
-      <w:r>
-        <w:t xml:space="preserve">the only drug–TB target trial emulation we identified concerned DPP-4 inhibitors [34].</w:t>
-      </w:r>
-    </w:p>
-    <w:p>
-      <w:pPr>
-        <w:pStyle w:val="BodyText"/>
-      </w:pPr>
-      <w:r>
         <w:t xml:space="preserve">These null results do not mean the drugs are safe. Glucocorticoids, biologics and JAK inhibitors</w:t>
       </w:r>
       <w:r>
@@ -2769,12 +2884,23 @@
         <w:t xml:space="preserve">auditing screening before biologics, JAK inhibitors and prolonged high-dose glucocorticoids.</w:t>
       </w:r>
     </w:p>
-    <w:p>
-      <w:pPr>
-        <w:pStyle w:val="BodyText"/>
-      </w:pPr>
-      <w:r>
-        <w:t xml:space="preserve">In conclusion, open English prescribing and TB notification data can be linked, but hospital</w:t>
+    <w:bookmarkEnd w:id="41"/>
+    <w:bookmarkEnd w:id="42"/>
+    <w:bookmarkStart w:id="43" w:name="conclusions"/>
+    <w:p>
+      <w:pPr>
+        <w:pStyle w:val="Heading2"/>
+      </w:pPr>
+      <w:r>
+        <w:t xml:space="preserve">Conclusions</w:t>
+      </w:r>
+    </w:p>
+    <w:p>
+      <w:pPr>
+        <w:pStyle w:val="FirstParagraph"/>
+      </w:pPr>
+      <w:r>
+        <w:t xml:space="preserve">Open English prescribing and TB notification data can be linked, but hospital</w:t>
       </w:r>
       <w:r>
         <w:t xml:space="preserve"> </w:t>
@@ -2801,8 +2927,8 @@
         <w:t xml:space="preserve">associations that do arise are compatible with residual confounding, chance or measurement error.</w:t>
       </w:r>
     </w:p>
-    <w:bookmarkEnd w:id="36"/>
-    <w:bookmarkStart w:id="37" w:name="tables"/>
+    <w:bookmarkEnd w:id="43"/>
+    <w:bookmarkStart w:id="44" w:name="tables"/>
     <w:p>
       <w:pPr>
         <w:pStyle w:val="Heading2"/>
@@ -5538,8 +5664,8 @@
         <w:t xml:space="preserve">Expected changes use published individual-level relative risks (ORs for oral glucocorticoids and PPIs) and UK prevalence of use, assuming that prevalence of use scales with prescribing, that extra prescribing reaches new users, a homogeneous baseline risk and aligned timing. Negative PAF values are prevented fractions. MDE = exp(2.80 × SE) − 1. The ratio of MDE to expected change is essentially independent of the 10% contrast, because for small changes both scale in proportion to it. Power is one-sided power to detect the expected effect in the correct direction. Benchmarks: recorded cases (steroids), UKHSA 2024, 100% recorded, RR 4.9: 0.043%; recorded cases (steroids), UKHSA 2024, 50% recorded, RR 4.9: 0.087%; recorded cases (biological_therapy), UKHSA 2024, 100% recorded, RR 4.9: 0.078%; recorded cases (biological_therapy), UKHSA 2024, 50% recorded, RR 4.9: 0.157%; age-stratified (oral corticosteroids, RR 4.9): 0.293%; homogeneous (oral corticosteroids, RR 4.9, prevalence 0.9%): 0.339%.</w:t>
       </w:r>
     </w:p>
-    <w:bookmarkEnd w:id="37"/>
-    <w:bookmarkStart w:id="38" w:name="figure-legends"/>
+    <w:bookmarkEnd w:id="44"/>
+    <w:bookmarkStart w:id="45" w:name="figure-legends"/>
     <w:p>
       <w:pPr>
         <w:pStyle w:val="Heading2"/>
@@ -5620,8 +5746,8 @@
         <w:t xml:space="preserve">Positive control: hospital treatment for active TB (pyrazinamide DDD-years per 1,000 residents) and TB notifications, between areas (left) and within areas over time (right).</w:t>
       </w:r>
     </w:p>
-    <w:bookmarkEnd w:id="38"/>
-    <w:bookmarkStart w:id="39" w:name="references"/>
+    <w:bookmarkEnd w:id="45"/>
+    <w:bookmarkStart w:id="46" w:name="references"/>
     <w:p>
       <w:pPr>
         <w:pStyle w:val="Heading2"/>
@@ -6550,8 +6676,8 @@
         <w:t xml:space="preserve">2025;23:587. doi:10.1186/s12916-025-04423-1. PMID 41137015</w:t>
       </w:r>
     </w:p>
-    <w:bookmarkEnd w:id="39"/>
-    <w:bookmarkEnd w:id="40"/>
+    <w:bookmarkEnd w:id="46"/>
+    <w:bookmarkEnd w:id="47"/>
     <w:sectPr/>
   </w:body>
 </w:document>

</xml_diff>